<commit_message>
tag04 gespeichert mit HA
</commit_message>
<xml_diff>
--- a/src/main/KursPlan.docx
+++ b/src/main/KursPlan.docx
@@ -5,10 +5,10 @@
     <w:p>
       <w:r>
         <w:drawing>
-          <wp:inline distT="0" distB="0" distL="0" distR="0" wp14:anchorId="73AD32DE" wp14:editId="56857405">
-            <wp:extent cx="4782217" cy="4477375"/>
-            <wp:effectExtent l="0" t="0" r="0" b="0"/>
-            <wp:docPr id="1914928739" name="Grafik 1"/>
+          <wp:inline distT="0" distB="0" distL="0" distR="0" wp14:anchorId="373EE9EB" wp14:editId="56B91296">
+            <wp:extent cx="5760720" cy="5025390"/>
+            <wp:effectExtent l="0" t="0" r="0" b="3810"/>
+            <wp:docPr id="666445533" name="Рисунок 1"/>
             <wp:cNvGraphicFramePr>
               <a:graphicFrameLocks xmlns:a="http://schemas.openxmlformats.org/drawingml/2006/main" noChangeAspect="1"/>
             </wp:cNvGraphicFramePr>
@@ -16,7 +16,7 @@
               <a:graphicData uri="http://schemas.openxmlformats.org/drawingml/2006/picture">
                 <pic:pic xmlns:pic="http://schemas.openxmlformats.org/drawingml/2006/picture">
                   <pic:nvPicPr>
-                    <pic:cNvPr id="1914928739" name=""/>
+                    <pic:cNvPr id="666445533" name=""/>
                     <pic:cNvPicPr/>
                   </pic:nvPicPr>
                   <pic:blipFill>
@@ -28,7 +28,7 @@
                   <pic:spPr>
                     <a:xfrm>
                       <a:off x="0" y="0"/>
-                      <a:ext cx="4782217" cy="4477375"/>
+                      <a:ext cx="5760720" cy="5025390"/>
                     </a:xfrm>
                     <a:prstGeom prst="rect">
                       <a:avLst/>
@@ -42,59 +42,20 @@
       </w:r>
     </w:p>
     <w:p>
-      <w:r>
-        <w:drawing>
-          <wp:inline distT="0" distB="0" distL="0" distR="0" wp14:anchorId="5A0A9ED2" wp14:editId="647BB4FB">
-            <wp:extent cx="3991532" cy="876422"/>
-            <wp:effectExtent l="0" t="0" r="9525" b="0"/>
-            <wp:docPr id="1037838820" name="Grafik 1"/>
-            <wp:cNvGraphicFramePr>
-              <a:graphicFrameLocks xmlns:a="http://schemas.openxmlformats.org/drawingml/2006/main" noChangeAspect="1"/>
-            </wp:cNvGraphicFramePr>
-            <a:graphic xmlns:a="http://schemas.openxmlformats.org/drawingml/2006/main">
-              <a:graphicData uri="http://schemas.openxmlformats.org/drawingml/2006/picture">
-                <pic:pic xmlns:pic="http://schemas.openxmlformats.org/drawingml/2006/picture">
-                  <pic:nvPicPr>
-                    <pic:cNvPr id="1037838820" name=""/>
-                    <pic:cNvPicPr/>
-                  </pic:nvPicPr>
-                  <pic:blipFill>
-                    <a:blip r:embed="rId5"/>
-                    <a:stretch>
-                      <a:fillRect/>
-                    </a:stretch>
-                  </pic:blipFill>
-                  <pic:spPr>
-                    <a:xfrm>
-                      <a:off x="0" y="0"/>
-                      <a:ext cx="3991532" cy="876422"/>
-                    </a:xfrm>
-                    <a:prstGeom prst="rect">
-                      <a:avLst/>
-                    </a:prstGeom>
-                  </pic:spPr>
-                </pic:pic>
-              </a:graphicData>
-            </a:graphic>
-          </wp:inline>
-        </w:drawing>
-      </w:r>
-    </w:p>
-    <w:p>
-      <w:hyperlink r:id="rId6" w:tgtFrame="_blank" w:tooltip="https://annas-archive.gl/" w:history="1">
+      <w:hyperlink r:id="rId5" w:tgtFrame="_blank" w:tooltip="https://annas-archive.gl/" w:history="1">
         <w:r>
           <w:rPr>
-            <w:rStyle w:val="Hyperlink"/>
+            <w:rStyle w:val="ac"/>
           </w:rPr>
           <w:t>https://annas-archive.gl/</w:t>
         </w:r>
       </w:hyperlink>
     </w:p>
     <w:p>
-      <w:hyperlink r:id="rId7" w:tgtFrame="_blank" w:tooltip="https://welib.org/" w:history="1">
+      <w:hyperlink r:id="rId6" w:tgtFrame="_blank" w:tooltip="https://welib.org/" w:history="1">
         <w:r>
           <w:rPr>
-            <w:rStyle w:val="Hyperlink"/>
+            <w:rStyle w:val="ac"/>
           </w:rPr>
           <w:t>https://welib.org/</w:t>
         </w:r>
@@ -508,15 +469,15 @@
     <w:lsdException w:name="Unresolved Mention" w:semiHidden="1" w:unhideWhenUsed="1"/>
     <w:lsdException w:name="Smart Link" w:semiHidden="1" w:unhideWhenUsed="1"/>
   </w:latentStyles>
-  <w:style w:type="paragraph" w:default="1" w:styleId="Standard">
+  <w:style w:type="paragraph" w:default="1" w:styleId="a">
     <w:name w:val="Normal"/>
     <w:qFormat/>
   </w:style>
-  <w:style w:type="paragraph" w:styleId="berschrift1">
+  <w:style w:type="paragraph" w:styleId="1">
     <w:name w:val="heading 1"/>
-    <w:basedOn w:val="Standard"/>
-    <w:next w:val="Standard"/>
-    <w:link w:val="berschrift1Zchn"/>
+    <w:basedOn w:val="a"/>
+    <w:next w:val="a"/>
+    <w:link w:val="10"/>
     <w:uiPriority w:val="9"/>
     <w:qFormat/>
     <w:rsid w:val="00EF6315"/>
@@ -533,11 +494,11 @@
       <w:szCs w:val="40"/>
     </w:rPr>
   </w:style>
-  <w:style w:type="paragraph" w:styleId="berschrift2">
+  <w:style w:type="paragraph" w:styleId="2">
     <w:name w:val="heading 2"/>
-    <w:basedOn w:val="Standard"/>
-    <w:next w:val="Standard"/>
-    <w:link w:val="berschrift2Zchn"/>
+    <w:basedOn w:val="a"/>
+    <w:next w:val="a"/>
+    <w:link w:val="20"/>
     <w:uiPriority w:val="9"/>
     <w:semiHidden/>
     <w:unhideWhenUsed/>
@@ -556,11 +517,11 @@
       <w:szCs w:val="32"/>
     </w:rPr>
   </w:style>
-  <w:style w:type="paragraph" w:styleId="berschrift3">
+  <w:style w:type="paragraph" w:styleId="3">
     <w:name w:val="heading 3"/>
-    <w:basedOn w:val="Standard"/>
-    <w:next w:val="Standard"/>
-    <w:link w:val="berschrift3Zchn"/>
+    <w:basedOn w:val="a"/>
+    <w:next w:val="a"/>
+    <w:link w:val="30"/>
     <w:uiPriority w:val="9"/>
     <w:semiHidden/>
     <w:unhideWhenUsed/>
@@ -579,11 +540,11 @@
       <w:szCs w:val="28"/>
     </w:rPr>
   </w:style>
-  <w:style w:type="paragraph" w:styleId="berschrift4">
+  <w:style w:type="paragraph" w:styleId="4">
     <w:name w:val="heading 4"/>
-    <w:basedOn w:val="Standard"/>
-    <w:next w:val="Standard"/>
-    <w:link w:val="berschrift4Zchn"/>
+    <w:basedOn w:val="a"/>
+    <w:next w:val="a"/>
+    <w:link w:val="40"/>
     <w:uiPriority w:val="9"/>
     <w:semiHidden/>
     <w:unhideWhenUsed/>
@@ -602,11 +563,11 @@
       <w:color w:val="0F4761" w:themeColor="accent1" w:themeShade="BF"/>
     </w:rPr>
   </w:style>
-  <w:style w:type="paragraph" w:styleId="berschrift5">
+  <w:style w:type="paragraph" w:styleId="5">
     <w:name w:val="heading 5"/>
-    <w:basedOn w:val="Standard"/>
-    <w:next w:val="Standard"/>
-    <w:link w:val="berschrift5Zchn"/>
+    <w:basedOn w:val="a"/>
+    <w:next w:val="a"/>
+    <w:link w:val="50"/>
     <w:uiPriority w:val="9"/>
     <w:semiHidden/>
     <w:unhideWhenUsed/>
@@ -623,11 +584,11 @@
       <w:color w:val="0F4761" w:themeColor="accent1" w:themeShade="BF"/>
     </w:rPr>
   </w:style>
-  <w:style w:type="paragraph" w:styleId="berschrift6">
+  <w:style w:type="paragraph" w:styleId="6">
     <w:name w:val="heading 6"/>
-    <w:basedOn w:val="Standard"/>
-    <w:next w:val="Standard"/>
-    <w:link w:val="berschrift6Zchn"/>
+    <w:basedOn w:val="a"/>
+    <w:next w:val="a"/>
+    <w:link w:val="60"/>
     <w:uiPriority w:val="9"/>
     <w:semiHidden/>
     <w:unhideWhenUsed/>
@@ -646,11 +607,11 @@
       <w:color w:val="595959" w:themeColor="text1" w:themeTint="A6"/>
     </w:rPr>
   </w:style>
-  <w:style w:type="paragraph" w:styleId="berschrift7">
+  <w:style w:type="paragraph" w:styleId="7">
     <w:name w:val="heading 7"/>
-    <w:basedOn w:val="Standard"/>
-    <w:next w:val="Standard"/>
-    <w:link w:val="berschrift7Zchn"/>
+    <w:basedOn w:val="a"/>
+    <w:next w:val="a"/>
+    <w:link w:val="70"/>
     <w:uiPriority w:val="9"/>
     <w:semiHidden/>
     <w:unhideWhenUsed/>
@@ -667,11 +628,11 @@
       <w:color w:val="595959" w:themeColor="text1" w:themeTint="A6"/>
     </w:rPr>
   </w:style>
-  <w:style w:type="paragraph" w:styleId="berschrift8">
+  <w:style w:type="paragraph" w:styleId="8">
     <w:name w:val="heading 8"/>
-    <w:basedOn w:val="Standard"/>
-    <w:next w:val="Standard"/>
-    <w:link w:val="berschrift8Zchn"/>
+    <w:basedOn w:val="a"/>
+    <w:next w:val="a"/>
+    <w:link w:val="80"/>
     <w:uiPriority w:val="9"/>
     <w:semiHidden/>
     <w:unhideWhenUsed/>
@@ -690,11 +651,11 @@
       <w:color w:val="272727" w:themeColor="text1" w:themeTint="D8"/>
     </w:rPr>
   </w:style>
-  <w:style w:type="paragraph" w:styleId="berschrift9">
+  <w:style w:type="paragraph" w:styleId="9">
     <w:name w:val="heading 9"/>
-    <w:basedOn w:val="Standard"/>
-    <w:next w:val="Standard"/>
-    <w:link w:val="berschrift9Zchn"/>
+    <w:basedOn w:val="a"/>
+    <w:next w:val="a"/>
+    <w:link w:val="90"/>
     <w:uiPriority w:val="9"/>
     <w:semiHidden/>
     <w:unhideWhenUsed/>
@@ -711,12 +672,13 @@
       <w:color w:val="272727" w:themeColor="text1" w:themeTint="D8"/>
     </w:rPr>
   </w:style>
-  <w:style w:type="character" w:default="1" w:styleId="Absatz-Standardschriftart">
+  <w:style w:type="character" w:default="1" w:styleId="a0">
     <w:name w:val="Default Paragraph Font"/>
     <w:uiPriority w:val="1"/>
+    <w:semiHidden/>
     <w:unhideWhenUsed/>
   </w:style>
-  <w:style w:type="table" w:default="1" w:styleId="NormaleTabelle">
+  <w:style w:type="table" w:default="1" w:styleId="a1">
     <w:name w:val="Normal Table"/>
     <w:uiPriority w:val="99"/>
     <w:semiHidden/>
@@ -731,16 +693,16 @@
       </w:tblCellMar>
     </w:tblPr>
   </w:style>
-  <w:style w:type="numbering" w:default="1" w:styleId="KeineListe">
+  <w:style w:type="numbering" w:default="1" w:styleId="a2">
     <w:name w:val="No List"/>
     <w:uiPriority w:val="99"/>
     <w:semiHidden/>
     <w:unhideWhenUsed/>
   </w:style>
-  <w:style w:type="character" w:customStyle="1" w:styleId="berschrift1Zchn">
-    <w:name w:val="Überschrift 1 Zchn"/>
-    <w:basedOn w:val="Absatz-Standardschriftart"/>
-    <w:link w:val="berschrift1"/>
+  <w:style w:type="character" w:customStyle="1" w:styleId="10">
+    <w:name w:val="Заголовок 1 Знак"/>
+    <w:basedOn w:val="a0"/>
+    <w:link w:val="1"/>
     <w:uiPriority w:val="9"/>
     <w:rsid w:val="00EF6315"/>
     <w:rPr>
@@ -750,10 +712,10 @@
       <w:szCs w:val="40"/>
     </w:rPr>
   </w:style>
-  <w:style w:type="character" w:customStyle="1" w:styleId="berschrift2Zchn">
-    <w:name w:val="Überschrift 2 Zchn"/>
-    <w:basedOn w:val="Absatz-Standardschriftart"/>
-    <w:link w:val="berschrift2"/>
+  <w:style w:type="character" w:customStyle="1" w:styleId="20">
+    <w:name w:val="Заголовок 2 Знак"/>
+    <w:basedOn w:val="a0"/>
+    <w:link w:val="2"/>
     <w:uiPriority w:val="9"/>
     <w:semiHidden/>
     <w:rsid w:val="00EF6315"/>
@@ -764,10 +726,10 @@
       <w:szCs w:val="32"/>
     </w:rPr>
   </w:style>
-  <w:style w:type="character" w:customStyle="1" w:styleId="berschrift3Zchn">
-    <w:name w:val="Überschrift 3 Zchn"/>
-    <w:basedOn w:val="Absatz-Standardschriftart"/>
-    <w:link w:val="berschrift3"/>
+  <w:style w:type="character" w:customStyle="1" w:styleId="30">
+    <w:name w:val="Заголовок 3 Знак"/>
+    <w:basedOn w:val="a0"/>
+    <w:link w:val="3"/>
     <w:uiPriority w:val="9"/>
     <w:semiHidden/>
     <w:rsid w:val="00EF6315"/>
@@ -778,10 +740,10 @@
       <w:szCs w:val="28"/>
     </w:rPr>
   </w:style>
-  <w:style w:type="character" w:customStyle="1" w:styleId="berschrift4Zchn">
-    <w:name w:val="Überschrift 4 Zchn"/>
-    <w:basedOn w:val="Absatz-Standardschriftart"/>
-    <w:link w:val="berschrift4"/>
+  <w:style w:type="character" w:customStyle="1" w:styleId="40">
+    <w:name w:val="Заголовок 4 Знак"/>
+    <w:basedOn w:val="a0"/>
+    <w:link w:val="4"/>
     <w:uiPriority w:val="9"/>
     <w:semiHidden/>
     <w:rsid w:val="00EF6315"/>
@@ -792,10 +754,10 @@
       <w:color w:val="0F4761" w:themeColor="accent1" w:themeShade="BF"/>
     </w:rPr>
   </w:style>
-  <w:style w:type="character" w:customStyle="1" w:styleId="berschrift5Zchn">
-    <w:name w:val="Überschrift 5 Zchn"/>
-    <w:basedOn w:val="Absatz-Standardschriftart"/>
-    <w:link w:val="berschrift5"/>
+  <w:style w:type="character" w:customStyle="1" w:styleId="50">
+    <w:name w:val="Заголовок 5 Знак"/>
+    <w:basedOn w:val="a0"/>
+    <w:link w:val="5"/>
     <w:uiPriority w:val="9"/>
     <w:semiHidden/>
     <w:rsid w:val="00EF6315"/>
@@ -804,10 +766,10 @@
       <w:color w:val="0F4761" w:themeColor="accent1" w:themeShade="BF"/>
     </w:rPr>
   </w:style>
-  <w:style w:type="character" w:customStyle="1" w:styleId="berschrift6Zchn">
-    <w:name w:val="Überschrift 6 Zchn"/>
-    <w:basedOn w:val="Absatz-Standardschriftart"/>
-    <w:link w:val="berschrift6"/>
+  <w:style w:type="character" w:customStyle="1" w:styleId="60">
+    <w:name w:val="Заголовок 6 Знак"/>
+    <w:basedOn w:val="a0"/>
+    <w:link w:val="6"/>
     <w:uiPriority w:val="9"/>
     <w:semiHidden/>
     <w:rsid w:val="00EF6315"/>
@@ -818,10 +780,10 @@
       <w:color w:val="595959" w:themeColor="text1" w:themeTint="A6"/>
     </w:rPr>
   </w:style>
-  <w:style w:type="character" w:customStyle="1" w:styleId="berschrift7Zchn">
-    <w:name w:val="Überschrift 7 Zchn"/>
-    <w:basedOn w:val="Absatz-Standardschriftart"/>
-    <w:link w:val="berschrift7"/>
+  <w:style w:type="character" w:customStyle="1" w:styleId="70">
+    <w:name w:val="Заголовок 7 Знак"/>
+    <w:basedOn w:val="a0"/>
+    <w:link w:val="7"/>
     <w:uiPriority w:val="9"/>
     <w:semiHidden/>
     <w:rsid w:val="00EF6315"/>
@@ -830,10 +792,10 @@
       <w:color w:val="595959" w:themeColor="text1" w:themeTint="A6"/>
     </w:rPr>
   </w:style>
-  <w:style w:type="character" w:customStyle="1" w:styleId="berschrift8Zchn">
-    <w:name w:val="Überschrift 8 Zchn"/>
-    <w:basedOn w:val="Absatz-Standardschriftart"/>
-    <w:link w:val="berschrift8"/>
+  <w:style w:type="character" w:customStyle="1" w:styleId="80">
+    <w:name w:val="Заголовок 8 Знак"/>
+    <w:basedOn w:val="a0"/>
+    <w:link w:val="8"/>
     <w:uiPriority w:val="9"/>
     <w:semiHidden/>
     <w:rsid w:val="00EF6315"/>
@@ -844,10 +806,10 @@
       <w:color w:val="272727" w:themeColor="text1" w:themeTint="D8"/>
     </w:rPr>
   </w:style>
-  <w:style w:type="character" w:customStyle="1" w:styleId="berschrift9Zchn">
-    <w:name w:val="Überschrift 9 Zchn"/>
-    <w:basedOn w:val="Absatz-Standardschriftart"/>
-    <w:link w:val="berschrift9"/>
+  <w:style w:type="character" w:customStyle="1" w:styleId="90">
+    <w:name w:val="Заголовок 9 Знак"/>
+    <w:basedOn w:val="a0"/>
+    <w:link w:val="9"/>
     <w:uiPriority w:val="9"/>
     <w:semiHidden/>
     <w:rsid w:val="00EF6315"/>
@@ -856,11 +818,11 @@
       <w:color w:val="272727" w:themeColor="text1" w:themeTint="D8"/>
     </w:rPr>
   </w:style>
-  <w:style w:type="paragraph" w:styleId="Titel">
+  <w:style w:type="paragraph" w:styleId="a3">
     <w:name w:val="Title"/>
-    <w:basedOn w:val="Standard"/>
-    <w:next w:val="Standard"/>
-    <w:link w:val="TitelZchn"/>
+    <w:basedOn w:val="a"/>
+    <w:next w:val="a"/>
+    <w:link w:val="a4"/>
     <w:uiPriority w:val="10"/>
     <w:qFormat/>
     <w:rsid w:val="00EF6315"/>
@@ -876,10 +838,10 @@
       <w:szCs w:val="56"/>
     </w:rPr>
   </w:style>
-  <w:style w:type="character" w:customStyle="1" w:styleId="TitelZchn">
-    <w:name w:val="Titel Zchn"/>
-    <w:basedOn w:val="Absatz-Standardschriftart"/>
-    <w:link w:val="Titel"/>
+  <w:style w:type="character" w:customStyle="1" w:styleId="a4">
+    <w:name w:val="Заголовок Знак"/>
+    <w:basedOn w:val="a0"/>
+    <w:link w:val="a3"/>
     <w:uiPriority w:val="10"/>
     <w:rsid w:val="00EF6315"/>
     <w:rPr>
@@ -890,11 +852,11 @@
       <w:szCs w:val="56"/>
     </w:rPr>
   </w:style>
-  <w:style w:type="paragraph" w:styleId="Untertitel">
+  <w:style w:type="paragraph" w:styleId="a5">
     <w:name w:val="Subtitle"/>
-    <w:basedOn w:val="Standard"/>
-    <w:next w:val="Standard"/>
-    <w:link w:val="UntertitelZchn"/>
+    <w:basedOn w:val="a"/>
+    <w:next w:val="a"/>
+    <w:link w:val="a6"/>
     <w:uiPriority w:val="11"/>
     <w:qFormat/>
     <w:rsid w:val="00EF6315"/>
@@ -911,10 +873,10 @@
       <w:szCs w:val="28"/>
     </w:rPr>
   </w:style>
-  <w:style w:type="character" w:customStyle="1" w:styleId="UntertitelZchn">
-    <w:name w:val="Untertitel Zchn"/>
-    <w:basedOn w:val="Absatz-Standardschriftart"/>
-    <w:link w:val="Untertitel"/>
+  <w:style w:type="character" w:customStyle="1" w:styleId="a6">
+    <w:name w:val="Подзаголовок Знак"/>
+    <w:basedOn w:val="a0"/>
+    <w:link w:val="a5"/>
     <w:uiPriority w:val="11"/>
     <w:rsid w:val="00EF6315"/>
     <w:rPr>
@@ -925,11 +887,11 @@
       <w:szCs w:val="28"/>
     </w:rPr>
   </w:style>
-  <w:style w:type="paragraph" w:styleId="Zitat">
+  <w:style w:type="paragraph" w:styleId="21">
     <w:name w:val="Quote"/>
-    <w:basedOn w:val="Standard"/>
-    <w:next w:val="Standard"/>
-    <w:link w:val="ZitatZchn"/>
+    <w:basedOn w:val="a"/>
+    <w:next w:val="a"/>
+    <w:link w:val="22"/>
     <w:uiPriority w:val="29"/>
     <w:qFormat/>
     <w:rsid w:val="00EF6315"/>
@@ -943,10 +905,10 @@
       <w:color w:val="404040" w:themeColor="text1" w:themeTint="BF"/>
     </w:rPr>
   </w:style>
-  <w:style w:type="character" w:customStyle="1" w:styleId="ZitatZchn">
-    <w:name w:val="Zitat Zchn"/>
-    <w:basedOn w:val="Absatz-Standardschriftart"/>
-    <w:link w:val="Zitat"/>
+  <w:style w:type="character" w:customStyle="1" w:styleId="22">
+    <w:name w:val="Цитата 2 Знак"/>
+    <w:basedOn w:val="a0"/>
+    <w:link w:val="21"/>
     <w:uiPriority w:val="29"/>
     <w:rsid w:val="00EF6315"/>
     <w:rPr>
@@ -955,9 +917,9 @@
       <w:color w:val="404040" w:themeColor="text1" w:themeTint="BF"/>
     </w:rPr>
   </w:style>
-  <w:style w:type="paragraph" w:styleId="Listenabsatz">
+  <w:style w:type="paragraph" w:styleId="a7">
     <w:name w:val="List Paragraph"/>
-    <w:basedOn w:val="Standard"/>
+    <w:basedOn w:val="a"/>
     <w:uiPriority w:val="34"/>
     <w:qFormat/>
     <w:rsid w:val="00EF6315"/>
@@ -966,9 +928,9 @@
       <w:contextualSpacing/>
     </w:pPr>
   </w:style>
-  <w:style w:type="character" w:styleId="IntensiveHervorhebung">
+  <w:style w:type="character" w:styleId="a8">
     <w:name w:val="Intense Emphasis"/>
-    <w:basedOn w:val="Absatz-Standardschriftart"/>
+    <w:basedOn w:val="a0"/>
     <w:uiPriority w:val="21"/>
     <w:qFormat/>
     <w:rsid w:val="00EF6315"/>
@@ -978,11 +940,11 @@
       <w:color w:val="0F4761" w:themeColor="accent1" w:themeShade="BF"/>
     </w:rPr>
   </w:style>
-  <w:style w:type="paragraph" w:styleId="IntensivesZitat">
+  <w:style w:type="paragraph" w:styleId="a9">
     <w:name w:val="Intense Quote"/>
-    <w:basedOn w:val="Standard"/>
-    <w:next w:val="Standard"/>
-    <w:link w:val="IntensivesZitatZchn"/>
+    <w:basedOn w:val="a"/>
+    <w:next w:val="a"/>
+    <w:link w:val="aa"/>
     <w:uiPriority w:val="30"/>
     <w:qFormat/>
     <w:rsid w:val="00EF6315"/>
@@ -1001,10 +963,10 @@
       <w:color w:val="0F4761" w:themeColor="accent1" w:themeShade="BF"/>
     </w:rPr>
   </w:style>
-  <w:style w:type="character" w:customStyle="1" w:styleId="IntensivesZitatZchn">
-    <w:name w:val="Intensives Zitat Zchn"/>
-    <w:basedOn w:val="Absatz-Standardschriftart"/>
-    <w:link w:val="IntensivesZitat"/>
+  <w:style w:type="character" w:customStyle="1" w:styleId="aa">
+    <w:name w:val="Выделенная цитата Знак"/>
+    <w:basedOn w:val="a0"/>
+    <w:link w:val="a9"/>
     <w:uiPriority w:val="30"/>
     <w:rsid w:val="00EF6315"/>
     <w:rPr>
@@ -1013,9 +975,9 @@
       <w:color w:val="0F4761" w:themeColor="accent1" w:themeShade="BF"/>
     </w:rPr>
   </w:style>
-  <w:style w:type="character" w:styleId="IntensiverVerweis">
+  <w:style w:type="character" w:styleId="ab">
     <w:name w:val="Intense Reference"/>
-    <w:basedOn w:val="Absatz-Standardschriftart"/>
+    <w:basedOn w:val="a0"/>
     <w:uiPriority w:val="32"/>
     <w:qFormat/>
     <w:rsid w:val="00EF6315"/>
@@ -1027,9 +989,9 @@
       <w:spacing w:val="5"/>
     </w:rPr>
   </w:style>
-  <w:style w:type="character" w:styleId="Hyperlink">
+  <w:style w:type="character" w:styleId="ac">
     <w:name w:val="Hyperlink"/>
-    <w:basedOn w:val="Absatz-Standardschriftart"/>
+    <w:basedOn w:val="a0"/>
     <w:uiPriority w:val="99"/>
     <w:unhideWhenUsed/>
     <w:rsid w:val="00C25577"/>
@@ -1038,9 +1000,9 @@
       <w:u w:val="single"/>
     </w:rPr>
   </w:style>
-  <w:style w:type="character" w:styleId="NichtaufgelsteErwhnung">
+  <w:style w:type="character" w:styleId="ad">
     <w:name w:val="Unresolved Mention"/>
-    <w:basedOn w:val="Absatz-Standardschriftart"/>
+    <w:basedOn w:val="a0"/>
     <w:uiPriority w:val="99"/>
     <w:semiHidden/>
     <w:unhideWhenUsed/>

</xml_diff>